<commit_message>
Agregar capturas del gate al informe
</commit_message>
<xml_diff>
--- a/docs/Informe_Final_Autonomous_Software_Factory_Juan_Jose_Cordova.docx
+++ b/docs/Informe_Final_Autonomous_Software_Factory_Juan_Jose_Cordova.docx
@@ -1199,6 +1199,50 @@
     </w:tbl>
     <w:p/>
     <w:p>
+      <w:r>
+        <w:rPr>
+          <w:b/>
+        </w:rPr>
+        <w:t>Captura de consola - bloqueo del gate:</w:t>
+      </w:r>
+    </w:p>
+    <w:p>
+      <w:r>
+        <w:drawing>
+          <wp:inline xmlns:a="http://schemas.openxmlformats.org/drawingml/2006/main" xmlns:pic="http://schemas.openxmlformats.org/drawingml/2006/picture">
+            <wp:extent cx="5760720" cy="1623476"/>
+            <wp:docPr id="1" name="Picture 1"/>
+            <wp:cNvGraphicFramePr>
+              <a:graphicFrameLocks noChangeAspect="1"/>
+            </wp:cNvGraphicFramePr>
+            <a:graphic>
+              <a:graphicData uri="http://schemas.openxmlformats.org/drawingml/2006/picture">
+                <pic:pic>
+                  <pic:nvPicPr>
+                    <pic:cNvPr id="0" name="gate-bloqueado.png"/>
+                    <pic:cNvPicPr/>
+                  </pic:nvPicPr>
+                  <pic:blipFill>
+                    <a:blip r:embed="rId9"/>
+                    <a:stretch>
+                      <a:fillRect/>
+                    </a:stretch>
+                  </pic:blipFill>
+                  <pic:spPr>
+                    <a:xfrm>
+                      <a:off x="0" y="0"/>
+                      <a:ext cx="5760720" cy="1623476"/>
+                    </a:xfrm>
+                    <a:prstGeom prst="rect"/>
+                  </pic:spPr>
+                </pic:pic>
+              </a:graphicData>
+            </a:graphic>
+          </wp:inline>
+        </w:drawing>
+      </w:r>
+    </w:p>
+    <w:p>
       <w:pPr>
         <w:pStyle w:val="Heading3"/>
       </w:pPr>
@@ -1241,6 +1285,50 @@
       </w:tr>
     </w:tbl>
     <w:p/>
+    <w:p>
+      <w:r>
+        <w:rPr>
+          <w:b/>
+        </w:rPr>
+        <w:t>Captura de consola - resolucion aprobada:</w:t>
+      </w:r>
+    </w:p>
+    <w:p>
+      <w:r>
+        <w:drawing>
+          <wp:inline xmlns:a="http://schemas.openxmlformats.org/drawingml/2006/main" xmlns:pic="http://schemas.openxmlformats.org/drawingml/2006/picture">
+            <wp:extent cx="5760720" cy="1623476"/>
+            <wp:docPr id="2" name="Picture 2"/>
+            <wp:cNvGraphicFramePr>
+              <a:graphicFrameLocks noChangeAspect="1"/>
+            </wp:cNvGraphicFramePr>
+            <a:graphic>
+              <a:graphicData uri="http://schemas.openxmlformats.org/drawingml/2006/picture">
+                <pic:pic>
+                  <pic:nvPicPr>
+                    <pic:cNvPr id="0" name="gate-aprobado.png"/>
+                    <pic:cNvPicPr/>
+                  </pic:nvPicPr>
+                  <pic:blipFill>
+                    <a:blip r:embed="rId10"/>
+                    <a:stretch>
+                      <a:fillRect/>
+                    </a:stretch>
+                  </pic:blipFill>
+                  <pic:spPr>
+                    <a:xfrm>
+                      <a:off x="0" y="0"/>
+                      <a:ext cx="5760720" cy="1623476"/>
+                    </a:xfrm>
+                    <a:prstGeom prst="rect"/>
+                  </pic:spPr>
+                </pic:pic>
+              </a:graphicData>
+            </a:graphic>
+          </wp:inline>
+        </w:drawing>
+      </w:r>
+    </w:p>
     <w:p>
       <w:pPr>
         <w:pStyle w:val="Heading1"/>

</xml_diff>

<commit_message>
Corregir ortografia del informe final
</commit_message>
<xml_diff>
--- a/docs/Informe_Final_Autonomous_Software_Factory_Juan_Jose_Cordova.docx
+++ b/docs/Informe_Final_Autonomous_Software_Factory_Juan_Jose_Cordova.docx
@@ -23,11 +23,11 @@
         <w:rPr>
           <w:b/>
         </w:rPr>
-        <w:t>Ingenieria de Software - Maestria en Software</w:t>
+        <w:t>Ingeniería de Software - Maestría en Software</w:t>
       </w:r>
       <w:r>
         <w:br/>
-        <w:t>Juan Jose Cordova</w:t>
+        <w:t>Juan José Córdova</w:t>
         <w:br/>
         <w:t>Fecha de entrega: 5 de julio de 2026</w:t>
         <w:br/>
@@ -269,12 +269,12 @@
         <w:pStyle w:val="Heading1"/>
       </w:pPr>
       <w:r>
-        <w:t>Introduccion</w:t>
+        <w:t>Introducción</w:t>
       </w:r>
     </w:p>
     <w:p>
       <w:r>
-        <w:t>Este informe integra los agentes trabajados durante la materia en un flujo completo de Autonomous Software Factory. El caso usado fue un sistema de reserva de citas dentales. La idea se descubrio con el Discovery Agent, se organizo con el Agile Delivery Team, se implemento una funcionalidad mediante SDD y finalmente se valido con el Quality Agent.</w:t>
+        <w:t>Este informe integra los agentes trabajados durante la materia en un flujo completo de Autonomous Software Factory. El caso usado fue un sistema de reserva de citas dentales. La idea se descubrió con el Discovery Agent, se organizo con el Agile Delivery Team, se implemento una funcionalidad mediante SDD y finalmente se validó con el Quality Agent.</w:t>
       </w:r>
     </w:p>
     <w:p>
@@ -282,12 +282,12 @@
         <w:pStyle w:val="Heading1"/>
       </w:pPr>
       <w:r>
-        <w:t>Analisis del Discovery Agent</w:t>
+        <w:t>Análisis del Discovery Agent</w:t>
       </w:r>
     </w:p>
     <w:p>
       <w:r>
-        <w:t>En la Unidad 1 utilice entrevistas de doctor, paciente y secretaria para descubrir el problema principal del producto. El hallazgo central fue que la agenda estaba dispersa entre WhatsApp, llamadas, papel y atencion presencial, sin una fuente unica de verdad.</w:t>
+        <w:t>En la Unidad 1 utilicé entrevistas de doctor, paciente y secretaria para descubrir el problema principal del producto. El hallazgo central fue que la agenda estaba dispersa entre WhatsApp, llamadas, papel y atención presencial, sin una fuente única de verdad.</w:t>
       </w:r>
     </w:p>
     <w:p>
@@ -303,7 +303,7 @@
         <w:pStyle w:val="ListBullet"/>
       </w:pPr>
       <w:r>
-        <w:t>Dolores principales: doble agendamiento, no-shows, falta de confirmacion y poca visibilidad de horarios.</w:t>
+        <w:t>Dolores principales: doble agendamiento, no-shows, falta de confirmación y poca visibilidad de horarios.</w:t>
       </w:r>
     </w:p>
     <w:p>
@@ -311,7 +311,7 @@
         <w:pStyle w:val="ListBullet"/>
       </w:pPr>
       <w:r>
-        <w:t>MVP definido: reserva autonoma de citas dentales sobre horarios reales.</w:t>
+        <w:t>MVP definido: reserva autónoma de citas dentales sobre horarios reales.</w:t>
       </w:r>
     </w:p>
     <w:p>
@@ -319,7 +319,7 @@
         <w:pStyle w:val="ListBullet"/>
       </w:pPr>
       <w:r>
-        <w:t>Metrica principal: reducir la tasa de no-show y aumentar citas gestionadas dentro del sistema.</w:t>
+        <w:t>Métrica principal: reducir la tasa de no-show y aumentar citas gestionadas dentro del sistema.</w:t>
       </w:r>
     </w:p>
     <w:p>
@@ -405,12 +405,12 @@
         <w:pStyle w:val="Heading1"/>
       </w:pPr>
       <w:r>
-        <w:t>Analisis del Agile Delivery Team</w:t>
+        <w:t>Análisis del Agile Delivery Team</w:t>
       </w:r>
     </w:p>
     <w:p>
       <w:r>
-        <w:t>En la Unidad 2 use los resultados del Discovery Agent como insumo para organizar el MVP en epicas, historias INVEST y un plan de sprint. El trabajo separo el valor del producto en reserva autonoma, confirmacion, fuente unica de recepcion y agenda del doctor.</w:t>
+        <w:t>En la Unidad 2 use los resultados del Discovery Agent como insumo para organizar el MVP en epicas, historias INVEST y un plan de sprint. El trabajo separo el valor del producto en reserva autónoma, confirmacion, fuente única de recepcion y agenda del doctor.</w:t>
       </w:r>
     </w:p>
     <w:tbl>
@@ -563,7 +563,7 @@
                 <w:b w:val="0"/>
                 <w:sz w:val="20"/>
               </w:rPr>
-              <w:t>Recepcion opera sobre una fuente unica, sin choques</w:t>
+              <w:t>Recepcion opera sobre una fuente única, sin choques</w:t>
             </w:r>
           </w:p>
         </w:tc>
@@ -608,7 +608,7 @@
     <w:p/>
     <w:p>
       <w:r>
-        <w:t>Para el trabajo nuevo seleccione la historia US-06 Anti doble-agendamiento, porque representa un riesgo real de operacion y obliga a validar concurrencia, no solo el camino feliz.</w:t>
+        <w:t>Para el trabajo nuevo seleccione la historia US-06 Anti doble-agendamiento, porque representa un riesgo real de operación y obliga a validar concurrencia, no solo el camino feliz.</w:t>
       </w:r>
     </w:p>
     <w:p>
@@ -641,7 +641,7 @@
                 <w:rFonts w:ascii="Consolas" w:hAnsi="Consolas"/>
                 <w:sz w:val="18"/>
               </w:rPr>
-              <w:t>Tomar el MVP Canvas, personas, requisitos e historias iniciales del Discovery Agent para generar epicas, historias de usuario INVEST, criterios de aceptacion, backlog priorizado y plan de sprint.</w:t>
+              <w:t>Tomar el MVP Canvas, personas, requisitos e historias iniciales del Discovery Agent para generar épicas, historias de usuario INVEST, criterios de aceptacion, backlog priorizado y plan de sprint.</w:t>
             </w:r>
           </w:p>
         </w:tc>
@@ -694,12 +694,12 @@
         <w:pStyle w:val="Heading1"/>
       </w:pPr>
       <w:r>
-        <w:t>Analisis del desarrollo con SDD</w:t>
+        <w:t>Análisis del desarrollo con SDD</w:t>
       </w:r>
     </w:p>
     <w:p>
       <w:r>
-        <w:t>La funcionalidad US-06 se implemento con Spec-Driven Development. Primero defini los criterios en Spec-Kit y luego implemente el servicio Spring Boot. Los artefactos quedaron versionados en `specs/us-06-anti-doble-agendamiento/`.</w:t>
+        <w:t>La funcionalidad US-06 se implementó con Spec-Driven Development. Primero definí los criterios en Spec-Kit y luego implementé el servicio Spring Boot. Los artefactos quedaron versionados en `specs/us-06-anti-doble-agendamiento/`.</w:t>
       </w:r>
     </w:p>
     <w:tbl>
@@ -744,7 +744,7 @@
                 <w:b/>
                 <w:sz w:val="20"/>
               </w:rPr>
-              <w:t>Proposito</w:t>
+              <w:t>Propósito</w:t>
             </w:r>
           </w:p>
         </w:tc>
@@ -816,7 +816,7 @@
                 <w:b w:val="0"/>
                 <w:sz w:val="20"/>
               </w:rPr>
-              <w:t>Explica stack, diseno tecnico y validacion</w:t>
+              <w:t>Explica stack, diseño técnico y validación</w:t>
             </w:r>
           </w:p>
         </w:tc>
@@ -852,7 +852,7 @@
                 <w:b w:val="0"/>
                 <w:sz w:val="20"/>
               </w:rPr>
-              <w:t>Lista tareas de implementacion, pruebas y calidad</w:t>
+              <w:t>Lista tareas de implementación, pruebas y calidad</w:t>
             </w:r>
           </w:p>
         </w:tc>
@@ -861,7 +861,7 @@
     <w:p/>
     <w:p>
       <w:r>
-        <w:t>El diseno usa `ConcurrentHashMap.putIfAbsent` para que el turno dental se reserve de forma atomica. Asi, cuando dos pacientes intentan tomar el mismo horario, solo una reserva queda registrada.</w:t>
+        <w:t>El diseño usa `ConcurrentHashMap.putIfAbsent` para que el turno dental se reserve de forma atómica. Así, cuando dos pacientes intentan tomar el mismo horario, solo una reserva queda registrada.</w:t>
       </w:r>
     </w:p>
     <w:p>
@@ -951,12 +951,12 @@
         <w:pStyle w:val="Heading1"/>
       </w:pPr>
       <w:r>
-        <w:t>Analisis del Quality Agent</w:t>
+        <w:t>Análisis del Quality Agent</w:t>
       </w:r>
     </w:p>
     <w:p>
       <w:r>
-        <w:t>La validacion se hizo con el Quality Agent de la Unidad 3, reutilizando su constitucion, skill, subagentes, comandos, hook y conexion MCP. El agente valido los tres pilares del Definition of Done: pruebas, seguridad y criterios.</w:t>
+        <w:t>La validación se hizo con el Quality Agent de la Unidad 3, reutilizando su constitución, skill, subagentes, comandos, hook y conexión MCP. El agente validó los tres pilares del Definition of Done: pruebas, seguridad y criterios.</w:t>
       </w:r>
     </w:p>
     <w:tbl>
@@ -1073,7 +1073,7 @@
                 <w:b w:val="0"/>
                 <w:sz w:val="20"/>
               </w:rPr>
-              <w:t>Semgrep sin hallazgos, 0 criticas y 0 secretos</w:t>
+              <w:t>Semgrep sin hallazgos, 0 críticas y 0 secretos</w:t>
             </w:r>
           </w:p>
         </w:tc>
@@ -1191,7 +1191,7 @@
               <w:br/>
               <w:t>CRITERIOS: FR-003 incumple; EDGE-CONCURRENCY incumple</w:t>
               <w:br/>
-              <w:t>Motivo: faltaba prueba explicita de concurrencia.</w:t>
+              <w:t>Motivo: faltaba prueba explícita de concurrencia.</w:t>
             </w:r>
           </w:p>
         </w:tc>
@@ -1276,7 +1276,7 @@
               <w:br/>
               <w:t>PRUEBAS: 7/7 - cobertura 90.9% &gt;= 80%</w:t>
               <w:br/>
-              <w:t>SEGURIDAD: 0 criticas - 0 secretos</w:t>
+              <w:t>SEGURIDAD: 0 críticas - 0 secretos</w:t>
               <w:br/>
               <w:t>CRITERIOS: 8 criterios cumplen</w:t>
             </w:r>
@@ -1290,7 +1290,7 @@
         <w:rPr>
           <w:b/>
         </w:rPr>
-        <w:t>Captura de consola - resolucion aprobada:</w:t>
+        <w:t>Captura de consola - resolución aprobada:</w:t>
       </w:r>
     </w:p>
     <w:p>
@@ -1342,7 +1342,7 @@
         <w:pStyle w:val="ListBullet"/>
       </w:pPr>
       <w:r>
-        <w:t>El flujo completo conecto descubrimiento, planificacion, desarrollo y validacion automatica.</w:t>
+        <w:t>El flujo completo conecto descubrimiento, planificación, desarrollo y validación automatica.</w:t>
       </w:r>
     </w:p>
     <w:p>
@@ -1350,7 +1350,7 @@
         <w:pStyle w:val="ListBullet"/>
       </w:pPr>
       <w:r>
-        <w:t>La historia US-06 demostro que la concurrencia debe probarse explicitamente y no asumirse por cobertura.</w:t>
+        <w:t>La historia US-06 demostró que la concurrencia debe probarse explícitamente y no asumirse por cobertura.</w:t>
       </w:r>
     </w:p>
     <w:p>
@@ -1358,7 +1358,7 @@
         <w:pStyle w:val="ListBullet"/>
       </w:pPr>
       <w:r>
-        <w:t>El Quality Gate cambio el cierre del trabajo: la funcionalidad solo se considero terminada cuando los tres pilares estuvieron en verde.</w:t>
+        <w:t>El Quality Gate cambio el cierre del trabajo: la funcionalidad solo se consideró terminada cuando los tres pilares estuvieron en verde.</w:t>
       </w:r>
     </w:p>
     <w:p>
@@ -1390,7 +1390,7 @@
         <w:pStyle w:val="ListBullet"/>
       </w:pPr>
       <w:r>
-        <w:t>Agregar el gate a integracion continua cuando el producto avance a mas funcionalidades.</w:t>
+        <w:t>Agregar el gate a integración continua cuando el producto avance a más funcionalidades.</w:t>
       </w:r>
     </w:p>
     <w:p>
@@ -1623,7 +1623,7 @@
         <w:pStyle w:val="ListBullet"/>
       </w:pPr>
       <w:r>
-        <w:t>Evidencia de resolucion: quality-output/gate-output.txt.</w:t>
+        <w:t>Evidencia de resolución: quality-output/gate-output.txt.</w:t>
       </w:r>
     </w:p>
     <w:sectPr>

</xml_diff>

<commit_message>
Quitar prompts del informe final
</commit_message>
<xml_diff>
--- a/docs/Informe_Final_Autonomous_Software_Factory_Juan_Jose_Cordova.docx
+++ b/docs/Informe_Final_Autonomous_Software_Factory_Juan_Jose_Cordova.docx
@@ -327,43 +327,6 @@
         <w:pStyle w:val="Heading3"/>
       </w:pPr>
       <w:r>
-        <w:t>Prompt utilizado</w:t>
-      </w:r>
-    </w:p>
-    <w:tbl>
-      <w:tblPr>
-        <w:tblStyle w:val="TableGrid"/>
-        <w:tblW w:type="auto" w:w="0"/>
-        <w:tblLook w:firstColumn="1" w:firstRow="1" w:lastColumn="0" w:lastRow="0" w:noHBand="0" w:noVBand="1" w:val="04A0"/>
-      </w:tblPr>
-      <w:tblGrid>
-        <w:gridCol w:w="9360"/>
-      </w:tblGrid>
-      <w:tr>
-        <w:tc>
-          <w:tcPr>
-            <w:tcW w:type="dxa" w:w="9360"/>
-            <w:shd w:fill="F2F4F7"/>
-          </w:tcPr>
-          <w:p>
-            <w:r/>
-            <w:r>
-              <w:rPr>
-                <w:rFonts w:ascii="Consolas" w:hAnsi="Consolas"/>
-                <w:sz w:val="18"/>
-              </w:rPr>
-              <w:t>Usar las entrevistas de doctor, paciente y secretaria para descubrir el MVP de un sistema de reserva de citas dentales. Identificar personas, dolores, propuesta de valor, MVP Canvas, riesgos, supuestos e historias iniciales.</w:t>
-            </w:r>
-          </w:p>
-        </w:tc>
-      </w:tr>
-    </w:tbl>
-    <w:p/>
-    <w:p>
-      <w:pPr>
-        <w:pStyle w:val="Heading3"/>
-      </w:pPr>
-      <w:r>
         <w:t>Log / evidencia</w:t>
       </w:r>
     </w:p>
@@ -616,43 +579,6 @@
         <w:pStyle w:val="Heading3"/>
       </w:pPr>
       <w:r>
-        <w:t>Prompt utilizado</w:t>
-      </w:r>
-    </w:p>
-    <w:tbl>
-      <w:tblPr>
-        <w:tblStyle w:val="TableGrid"/>
-        <w:tblW w:type="auto" w:w="0"/>
-        <w:tblLook w:firstColumn="1" w:firstRow="1" w:lastColumn="0" w:lastRow="0" w:noHBand="0" w:noVBand="1" w:val="04A0"/>
-      </w:tblPr>
-      <w:tblGrid>
-        <w:gridCol w:w="9360"/>
-      </w:tblGrid>
-      <w:tr>
-        <w:tc>
-          <w:tcPr>
-            <w:tcW w:type="dxa" w:w="9360"/>
-            <w:shd w:fill="F2F4F7"/>
-          </w:tcPr>
-          <w:p>
-            <w:r/>
-            <w:r>
-              <w:rPr>
-                <w:rFonts w:ascii="Consolas" w:hAnsi="Consolas"/>
-                <w:sz w:val="18"/>
-              </w:rPr>
-              <w:t>Tomar el MVP Canvas, personas, requisitos e historias iniciales del Discovery Agent para generar épicas, historias de usuario INVEST, criterios de aceptacion, backlog priorizado y plan de sprint.</w:t>
-            </w:r>
-          </w:p>
-        </w:tc>
-      </w:tr>
-    </w:tbl>
-    <w:p/>
-    <w:p>
-      <w:pPr>
-        <w:pStyle w:val="Heading3"/>
-      </w:pPr>
-      <w:r>
         <w:t>Log / evidencia</w:t>
       </w:r>
     </w:p>
@@ -869,43 +795,6 @@
         <w:pStyle w:val="Heading3"/>
       </w:pPr>
       <w:r>
-        <w:t>Prompt utilizado</w:t>
-      </w:r>
-    </w:p>
-    <w:tbl>
-      <w:tblPr>
-        <w:tblStyle w:val="TableGrid"/>
-        <w:tblW w:type="auto" w:w="0"/>
-        <w:tblLook w:firstColumn="1" w:firstRow="1" w:lastColumn="0" w:lastRow="0" w:noHBand="0" w:noVBand="1" w:val="04A0"/>
-      </w:tblPr>
-      <w:tblGrid>
-        <w:gridCol w:w="9360"/>
-      </w:tblGrid>
-      <w:tr>
-        <w:tc>
-          <w:tcPr>
-            <w:tcW w:type="dxa" w:w="9360"/>
-            <w:shd w:fill="F2F4F7"/>
-          </w:tcPr>
-          <w:p>
-            <w:r/>
-            <w:r>
-              <w:rPr>
-                <w:rFonts w:ascii="Consolas" w:hAnsi="Consolas"/>
-                <w:sz w:val="18"/>
-              </w:rPr>
-              <w:t>Implementar la historia US-06 Anti doble-agendamiento usando Spec-Driven Development con Spec-Kit. Crear spec.md, plan.md y tasks.md; luego implementar Java + Spring Boot con pruebas automatizadas.</w:t>
-            </w:r>
-          </w:p>
-        </w:tc>
-      </w:tr>
-    </w:tbl>
-    <w:p/>
-    <w:p>
-      <w:pPr>
-        <w:pStyle w:val="Heading3"/>
-      </w:pPr>
-      <w:r>
         <w:t>Log / evidencia</w:t>
       </w:r>
     </w:p>
@@ -1110,43 +999,6 @@
                 <w:sz w:val="20"/>
               </w:rPr>
               <w:t>FR-001 a FR-007 y edge case de concurrencia cubiertos</w:t>
-            </w:r>
-          </w:p>
-        </w:tc>
-      </w:tr>
-    </w:tbl>
-    <w:p/>
-    <w:p>
-      <w:pPr>
-        <w:pStyle w:val="Heading3"/>
-      </w:pPr>
-      <w:r>
-        <w:t>Prompt utilizado</w:t>
-      </w:r>
-    </w:p>
-    <w:tbl>
-      <w:tblPr>
-        <w:tblStyle w:val="TableGrid"/>
-        <w:tblW w:type="auto" w:w="0"/>
-        <w:tblLook w:firstColumn="1" w:firstRow="1" w:lastColumn="0" w:lastRow="0" w:noHBand="0" w:noVBand="1" w:val="04A0"/>
-      </w:tblPr>
-      <w:tblGrid>
-        <w:gridCol w:w="9360"/>
-      </w:tblGrid>
-      <w:tr>
-        <w:tc>
-          <w:tcPr>
-            <w:tcW w:type="dxa" w:w="9360"/>
-            <w:shd w:fill="F2F4F7"/>
-          </w:tcPr>
-          <w:p>
-            <w:r/>
-            <w:r>
-              <w:rPr>
-                <w:rFonts w:ascii="Consolas" w:hAnsi="Consolas"/>
-                <w:sz w:val="18"/>
-              </w:rPr>
-              <w:t>Validar el proyecto Spring Boot de citas dentales con el Quality Agent. Leer criterios desde specs/us-06-anti-doble-agendamiento/spec.md, ejecutar pruebas/cobertura, revisar seguridad y generar verification.json y report.html.</w:t>
             </w:r>
           </w:p>
         </w:tc>

</xml_diff>

<commit_message>
Limpiar informe y dejar evidencias como capturas
</commit_message>
<xml_diff>
--- a/docs/Informe_Final_Autonomous_Software_Factory_Juan_Jose_Cordova.docx
+++ b/docs/Informe_Final_Autonomous_Software_Factory_Juan_Jose_Cordova.docx
@@ -324,47 +324,6 @@
     </w:p>
     <w:p>
       <w:pPr>
-        <w:pStyle w:val="Heading3"/>
-      </w:pPr>
-      <w:r>
-        <w:t>Log / evidencia</w:t>
-      </w:r>
-    </w:p>
-    <w:tbl>
-      <w:tblPr>
-        <w:tblStyle w:val="TableGrid"/>
-        <w:tblW w:type="auto" w:w="0"/>
-        <w:tblLook w:firstColumn="1" w:firstRow="1" w:lastColumn="0" w:lastRow="0" w:noHBand="0" w:noVBand="1" w:val="04A0"/>
-      </w:tblPr>
-      <w:tblGrid>
-        <w:gridCol w:w="9360"/>
-      </w:tblGrid>
-      <w:tr>
-        <w:tc>
-          <w:tcPr>
-            <w:tcW w:type="dxa" w:w="9360"/>
-            <w:shd w:fill="F2F4F7"/>
-          </w:tcPr>
-          <w:p>
-            <w:r/>
-            <w:r>
-              <w:rPr>
-                <w:rFonts w:ascii="Consolas" w:hAnsi="Consolas"/>
-                <w:sz w:val="18"/>
-              </w:rPr>
-              <w:t>Repositorio: https://github.com/juancvxdev/discovery-agent</w:t>
-              <w:br/>
-              <w:t>Artefactos: discoveries/citasdentista/outputs/mvp-canvas.md, personas.md, user-stories.md, report.html</w:t>
-              <w:br/>
-              <w:t>Resultado: MVP Canvas de citasdentista con propuesta de valor y metrica de no-show.</w:t>
-            </w:r>
-          </w:p>
-        </w:tc>
-      </w:tr>
-    </w:tbl>
-    <w:p/>
-    <w:p>
-      <w:pPr>
         <w:pStyle w:val="Heading1"/>
       </w:pPr>
       <w:r>
@@ -576,47 +535,6 @@
     </w:p>
     <w:p>
       <w:pPr>
-        <w:pStyle w:val="Heading3"/>
-      </w:pPr>
-      <w:r>
-        <w:t>Log / evidencia</w:t>
-      </w:r>
-    </w:p>
-    <w:tbl>
-      <w:tblPr>
-        <w:tblStyle w:val="TableGrid"/>
-        <w:tblW w:type="auto" w:w="0"/>
-        <w:tblLook w:firstColumn="1" w:firstRow="1" w:lastColumn="0" w:lastRow="0" w:noHBand="0" w:noVBand="1" w:val="04A0"/>
-      </w:tblPr>
-      <w:tblGrid>
-        <w:gridCol w:w="9360"/>
-      </w:tblGrid>
-      <w:tr>
-        <w:tc>
-          <w:tcPr>
-            <w:tcW w:type="dxa" w:w="9360"/>
-            <w:shd w:fill="F2F4F7"/>
-          </w:tcPr>
-          <w:p>
-            <w:r/>
-            <w:r>
-              <w:rPr>
-                <w:rFonts w:ascii="Consolas" w:hAnsi="Consolas"/>
-                <w:sz w:val="18"/>
-              </w:rPr>
-              <w:t>Repositorio: https://github.com/juancvxdev/agile-delivery-team</w:t>
-              <w:br/>
-              <w:t>Artefactos: deliveries/citasdentista/outputs/epics.md, stories.md, sprint-plan.md, architecture.md</w:t>
-              <w:br/>
-              <w:t>Historia seleccionada: US-06 Anti doble-agendamiento.</w:t>
-            </w:r>
-          </w:p>
-        </w:tc>
-      </w:tr>
-    </w:tbl>
-    <w:p/>
-    <w:p>
-      <w:pPr>
         <w:pStyle w:val="Heading1"/>
       </w:pPr>
       <w:r>
@@ -792,51 +710,6 @@
     </w:p>
     <w:p>
       <w:pPr>
-        <w:pStyle w:val="Heading3"/>
-      </w:pPr>
-      <w:r>
-        <w:t>Log / evidencia</w:t>
-      </w:r>
-    </w:p>
-    <w:tbl>
-      <w:tblPr>
-        <w:tblStyle w:val="TableGrid"/>
-        <w:tblW w:type="auto" w:w="0"/>
-        <w:tblLook w:firstColumn="1" w:firstRow="1" w:lastColumn="0" w:lastRow="0" w:noHBand="0" w:noVBand="1" w:val="04A0"/>
-      </w:tblPr>
-      <w:tblGrid>
-        <w:gridCol w:w="9360"/>
-      </w:tblGrid>
-      <w:tr>
-        <w:tc>
-          <w:tcPr>
-            <w:tcW w:type="dxa" w:w="9360"/>
-            <w:shd w:fill="F2F4F7"/>
-          </w:tcPr>
-          <w:p>
-            <w:r/>
-            <w:r>
-              <w:rPr>
-                <w:rFonts w:ascii="Consolas" w:hAnsi="Consolas"/>
-                <w:sz w:val="18"/>
-              </w:rPr>
-              <w:t>Pruebas ejecutadas: 7</w:t>
-              <w:br/>
-              <w:t>Fallos: 0</w:t>
-              <w:br/>
-              <w:t>Errores: 0</w:t>
-              <w:br/>
-              <w:t>Cobertura JaCoCo: 90.9%</w:t>
-              <w:br/>
-              <w:t>Archivos principales: AgendaDentalService.java, AgendaDentalController.java, AgendaDentalServiceTest.java</w:t>
-            </w:r>
-          </w:p>
-        </w:tc>
-      </w:tr>
-    </w:tbl>
-    <w:p/>
-    <w:p>
-      <w:pPr>
         <w:pStyle w:val="Heading1"/>
       </w:pPr>
       <w:r>
@@ -1006,50 +879,10 @@
     </w:tbl>
     <w:p/>
     <w:p>
-      <w:pPr>
-        <w:pStyle w:val="Heading3"/>
-      </w:pPr>
       <w:r>
-        <w:t>Gate bloqueado</w:t>
+        <w:t>Como evidencia de validacion automatica se incluyeron las capturas de consola del gate bloqueado y del gate aprobado, generadas desde este proyecto final.</w:t>
       </w:r>
     </w:p>
-    <w:tbl>
-      <w:tblPr>
-        <w:tblStyle w:val="TableGrid"/>
-        <w:tblW w:type="auto" w:w="0"/>
-        <w:tblLook w:firstColumn="1" w:firstRow="1" w:lastColumn="0" w:lastRow="0" w:noHBand="0" w:noVBand="1" w:val="04A0"/>
-      </w:tblPr>
-      <w:tblGrid>
-        <w:gridCol w:w="9360"/>
-      </w:tblGrid>
-      <w:tr>
-        <w:tc>
-          <w:tcPr>
-            <w:tcW w:type="dxa" w:w="9360"/>
-            <w:shd w:fill="F2F4F7"/>
-          </w:tcPr>
-          <w:p>
-            <w:r/>
-            <w:r>
-              <w:rPr>
-                <w:rFonts w:ascii="Consolas" w:hAnsi="Consolas"/>
-                <w:sz w:val="18"/>
-              </w:rPr>
-              <w:t>GATE DE CALIDAD: BLOQUEADO</w:t>
-              <w:br/>
-              <w:t>PRUEBAS: OK</w:t>
-              <w:br/>
-              <w:t>SEGURIDAD: OK</w:t>
-              <w:br/>
-              <w:t>CRITERIOS: FR-003 incumple; EDGE-CONCURRENCY incumple</w:t>
-              <w:br/>
-              <w:t>Motivo: faltaba prueba explícita de concurrencia.</w:t>
-            </w:r>
-          </w:p>
-        </w:tc>
-      </w:tr>
-    </w:tbl>
-    <w:p/>
     <w:p>
       <w:r>
         <w:rPr>
@@ -1094,49 +927,6 @@
         </w:drawing>
       </w:r>
     </w:p>
-    <w:p>
-      <w:pPr>
-        <w:pStyle w:val="Heading3"/>
-      </w:pPr>
-      <w:r>
-        <w:t>Gate aprobado</w:t>
-      </w:r>
-    </w:p>
-    <w:tbl>
-      <w:tblPr>
-        <w:tblStyle w:val="TableGrid"/>
-        <w:tblW w:type="auto" w:w="0"/>
-        <w:tblLook w:firstColumn="1" w:firstRow="1" w:lastColumn="0" w:lastRow="0" w:noHBand="0" w:noVBand="1" w:val="04A0"/>
-      </w:tblPr>
-      <w:tblGrid>
-        <w:gridCol w:w="9360"/>
-      </w:tblGrid>
-      <w:tr>
-        <w:tc>
-          <w:tcPr>
-            <w:tcW w:type="dxa" w:w="9360"/>
-            <w:shd w:fill="F2F4F7"/>
-          </w:tcPr>
-          <w:p>
-            <w:r/>
-            <w:r>
-              <w:rPr>
-                <w:rFonts w:ascii="Consolas" w:hAnsi="Consolas"/>
-                <w:sz w:val="18"/>
-              </w:rPr>
-              <w:t>GATE DE CALIDAD: APROBADO</w:t>
-              <w:br/>
-              <w:t>PRUEBAS: 7/7 - cobertura 90.9% &gt;= 80%</w:t>
-              <w:br/>
-              <w:t>SEGURIDAD: 0 críticas - 0 secretos</w:t>
-              <w:br/>
-              <w:t>CRITERIOS: 8 criterios cumplen</w:t>
-            </w:r>
-          </w:p>
-        </w:tc>
-      </w:tr>
-    </w:tbl>
-    <w:p/>
     <w:p>
       <w:r>
         <w:rPr>

</xml_diff>

<commit_message>
Agregar capturas por agente al informe
</commit_message>
<xml_diff>
--- a/docs/Informe_Final_Autonomous_Software_Factory_Juan_Jose_Cordova.docx
+++ b/docs/Informe_Final_Autonomous_Software_Factory_Juan_Jose_Cordova.docx
@@ -323,6 +323,50 @@
       </w:r>
     </w:p>
     <w:p>
+      <w:r>
+        <w:rPr>
+          <w:b/>
+        </w:rPr>
+        <w:t>Captura de evidencia usada del Discovery Agent:</w:t>
+      </w:r>
+    </w:p>
+    <w:p>
+      <w:r>
+        <w:drawing>
+          <wp:inline xmlns:a="http://schemas.openxmlformats.org/drawingml/2006/main" xmlns:pic="http://schemas.openxmlformats.org/drawingml/2006/picture">
+            <wp:extent cx="5760720" cy="1757508"/>
+            <wp:docPr id="1" name="Picture 1"/>
+            <wp:cNvGraphicFramePr>
+              <a:graphicFrameLocks noChangeAspect="1"/>
+            </wp:cNvGraphicFramePr>
+            <a:graphic>
+              <a:graphicData uri="http://schemas.openxmlformats.org/drawingml/2006/picture">
+                <pic:pic>
+                  <pic:nvPicPr>
+                    <pic:cNvPr id="0" name="discovery-agent.png"/>
+                    <pic:cNvPicPr/>
+                  </pic:nvPicPr>
+                  <pic:blipFill>
+                    <a:blip r:embed="rId9"/>
+                    <a:stretch>
+                      <a:fillRect/>
+                    </a:stretch>
+                  </pic:blipFill>
+                  <pic:spPr>
+                    <a:xfrm>
+                      <a:off x="0" y="0"/>
+                      <a:ext cx="5760720" cy="1757508"/>
+                    </a:xfrm>
+                    <a:prstGeom prst="rect"/>
+                  </pic:spPr>
+                </pic:pic>
+              </a:graphicData>
+            </a:graphic>
+          </wp:inline>
+        </w:drawing>
+      </w:r>
+    </w:p>
+    <w:p>
       <w:pPr>
         <w:pStyle w:val="Heading1"/>
       </w:pPr>
@@ -534,6 +578,50 @@
       </w:r>
     </w:p>
     <w:p>
+      <w:r>
+        <w:rPr>
+          <w:b/>
+        </w:rPr>
+        <w:t>Captura de evidencia usada del Agile Delivery Team:</w:t>
+      </w:r>
+    </w:p>
+    <w:p>
+      <w:r>
+        <w:drawing>
+          <wp:inline xmlns:a="http://schemas.openxmlformats.org/drawingml/2006/main" xmlns:pic="http://schemas.openxmlformats.org/drawingml/2006/picture">
+            <wp:extent cx="5760720" cy="1757508"/>
+            <wp:docPr id="2" name="Picture 2"/>
+            <wp:cNvGraphicFramePr>
+              <a:graphicFrameLocks noChangeAspect="1"/>
+            </wp:cNvGraphicFramePr>
+            <a:graphic>
+              <a:graphicData uri="http://schemas.openxmlformats.org/drawingml/2006/picture">
+                <pic:pic>
+                  <pic:nvPicPr>
+                    <pic:cNvPr id="0" name="agile-delivery-team.png"/>
+                    <pic:cNvPicPr/>
+                  </pic:nvPicPr>
+                  <pic:blipFill>
+                    <a:blip r:embed="rId10"/>
+                    <a:stretch>
+                      <a:fillRect/>
+                    </a:stretch>
+                  </pic:blipFill>
+                  <pic:spPr>
+                    <a:xfrm>
+                      <a:off x="0" y="0"/>
+                      <a:ext cx="5760720" cy="1757508"/>
+                    </a:xfrm>
+                    <a:prstGeom prst="rect"/>
+                  </pic:spPr>
+                </pic:pic>
+              </a:graphicData>
+            </a:graphic>
+          </wp:inline>
+        </w:drawing>
+      </w:r>
+    </w:p>
+    <w:p>
       <w:pPr>
         <w:pStyle w:val="Heading1"/>
       </w:pPr>
@@ -706,6 +794,50 @@
     <w:p>
       <w:r>
         <w:t>El diseño usa `ConcurrentHashMap.putIfAbsent` para que el turno dental se reserve de forma atómica. Así, cuando dos pacientes intentan tomar el mismo horario, solo una reserva queda registrada.</w:t>
+      </w:r>
+    </w:p>
+    <w:p>
+      <w:r>
+        <w:rPr>
+          <w:b/>
+        </w:rPr>
+        <w:t>Captura de evidencia generada con Spec-Kit:</w:t>
+      </w:r>
+    </w:p>
+    <w:p>
+      <w:r>
+        <w:drawing>
+          <wp:inline xmlns:a="http://schemas.openxmlformats.org/drawingml/2006/main" xmlns:pic="http://schemas.openxmlformats.org/drawingml/2006/picture">
+            <wp:extent cx="5760720" cy="1757508"/>
+            <wp:docPr id="3" name="Picture 3"/>
+            <wp:cNvGraphicFramePr>
+              <a:graphicFrameLocks noChangeAspect="1"/>
+            </wp:cNvGraphicFramePr>
+            <a:graphic>
+              <a:graphicData uri="http://schemas.openxmlformats.org/drawingml/2006/picture">
+                <pic:pic>
+                  <pic:nvPicPr>
+                    <pic:cNvPr id="0" name="sdd-spec-kit.png"/>
+                    <pic:cNvPicPr/>
+                  </pic:nvPicPr>
+                  <pic:blipFill>
+                    <a:blip r:embed="rId11"/>
+                    <a:stretch>
+                      <a:fillRect/>
+                    </a:stretch>
+                  </pic:blipFill>
+                  <pic:spPr>
+                    <a:xfrm>
+                      <a:off x="0" y="0"/>
+                      <a:ext cx="5760720" cy="1757508"/>
+                    </a:xfrm>
+                    <a:prstGeom prst="rect"/>
+                  </pic:spPr>
+                </pic:pic>
+              </a:graphicData>
+            </a:graphic>
+          </wp:inline>
+        </w:drawing>
       </w:r>
     </w:p>
     <w:p>
@@ -896,7 +1028,7 @@
         <w:drawing>
           <wp:inline xmlns:a="http://schemas.openxmlformats.org/drawingml/2006/main" xmlns:pic="http://schemas.openxmlformats.org/drawingml/2006/picture">
             <wp:extent cx="5760720" cy="1623476"/>
-            <wp:docPr id="1" name="Picture 1"/>
+            <wp:docPr id="4" name="Picture 4"/>
             <wp:cNvGraphicFramePr>
               <a:graphicFrameLocks noChangeAspect="1"/>
             </wp:cNvGraphicFramePr>
@@ -908,7 +1040,7 @@
                     <pic:cNvPicPr/>
                   </pic:nvPicPr>
                   <pic:blipFill>
-                    <a:blip r:embed="rId9"/>
+                    <a:blip r:embed="rId12"/>
                     <a:stretch>
                       <a:fillRect/>
                     </a:stretch>
@@ -940,7 +1072,7 @@
         <w:drawing>
           <wp:inline xmlns:a="http://schemas.openxmlformats.org/drawingml/2006/main" xmlns:pic="http://schemas.openxmlformats.org/drawingml/2006/picture">
             <wp:extent cx="5760720" cy="1623476"/>
-            <wp:docPr id="2" name="Picture 2"/>
+            <wp:docPr id="5" name="Picture 5"/>
             <wp:cNvGraphicFramePr>
               <a:graphicFrameLocks noChangeAspect="1"/>
             </wp:cNvGraphicFramePr>
@@ -952,7 +1084,7 @@
                     <pic:cNvPicPr/>
                   </pic:nvPicPr>
                   <pic:blipFill>
-                    <a:blip r:embed="rId10"/>
+                    <a:blip r:embed="rId13"/>
                     <a:stretch>
                       <a:fillRect/>
                     </a:stretch>

</xml_diff>